<commit_message>
Keep each UTM report limited to its own week
Add the Desconocido / Other remainder to every weekly category table and rewrite the closing note so it only states findings from that week's Fortinet PDFs.

Co-authored-by: Daniel Cristancho <dkring85@users.noreply.github.com>
</commit_message>
<xml_diff>
--- a/informes-utm/Informe_UTM_64046_2026-08-10_a_2026-08-16.docx
+++ b/informes-utm/Informe_UTM_64046_2026-08-10_a_2026-08-16.docx
@@ -29,12 +29,12 @@
     </w:p>
     <w:p>
       <w:r>
-        <w:t>Esta semana se sale del patrón habitual. General Interest pasa al primer lugar (1.88 TB, 46.49 %) casi todo en Google.Services (1.79 TB). Network Service queda segundo (QUIC 406.28 GB, SSL y TLS). WhatsApp sigue siendo la aplicación de colaboración más pesada (338.08 GB más 101.56 GB de transferencia de archivos). Windows Update aporta 210.99 GB y Adobe Update 38.00 GB, descargas de mantenimiento.</w:t>
+        <w:t>General Interest ocupa el primer lugar (1.88 TB, 46.49 %) casi todo en Google.Services (1.79 TB). Network Service queda segundo (QUIC 406.28 GB, SSL y TLS). WhatsApp es la aplicación de colaboración más pesada (338.08 GB más 101.56 GB de transferencia de archivos). Windows Update aporta 210.99 GB y Adobe Update 38.00 GB, descargas de mantenimiento.</w:t>
       </w:r>
     </w:p>
     <w:p>
       <w:r>
-        <w:t>Remote Access se mantiene con AnyDesk como herramienta principal y un residual de TeamViewer, coherente con soportes remotos, siempre que el inventario de sistemas lo confirme. La categoría Proxy sigue mostrando clientes de evasión (Hola.VPN, Psiphon, Proton, Ultrasurf o similares), con poco volumen pero con el mismo comportamiento de las semanas anteriores.</w:t>
+        <w:t>Remote Access muestra AnyDesk como herramienta principal y un residual de TeamViewer. Conviene confirmar que corresponda a soportes autorizados. La categoría Proxy de este corte incluye clientes de evasión (Hola.VPN, Psiphon, Proton, Ultrasurf o similares), con poco volumen.</w:t>
       </w:r>
     </w:p>
     <w:p>
@@ -88,7 +88,7 @@
           </w:tcPr>
           <w:p>
             <w:r>
-              <w:t>%</w:t>
+              <w:t>% aprox.</w:t>
             </w:r>
           </w:p>
         </w:tc>
@@ -228,39 +228,7 @@
           </w:tcPr>
           <w:p>
             <w:r>
-              <w:t>Unknown</w:t>
-            </w:r>
-          </w:p>
-        </w:tc>
-        <w:tc>
-          <w:tcPr>
-            <w:tcW w:type="dxa" w:w="2880"/>
-          </w:tcPr>
-          <w:p>
-            <w:r>
-              <w:t>90.62 GB</w:t>
-            </w:r>
-          </w:p>
-        </w:tc>
-        <w:tc>
-          <w:tcPr>
-            <w:tcW w:type="dxa" w:w="2880"/>
-          </w:tcPr>
-          <w:p>
-            <w:r>
-              <w:t>2.19 %</w:t>
-            </w:r>
-          </w:p>
-        </w:tc>
-      </w:tr>
-      <w:tr>
-        <w:tc>
-          <w:tcPr>
-            <w:tcW w:type="dxa" w:w="2880"/>
-          </w:tcPr>
-          <w:p>
-            <w:r>
-              <w:t>Storage Backup</w:t>
+              <w:t>Storage.Backup</w:t>
             </w:r>
           </w:p>
         </w:tc>
@@ -285,11 +253,43 @@
           </w:p>
         </w:tc>
       </w:tr>
+      <w:tr>
+        <w:tc>
+          <w:tcPr>
+            <w:tcW w:type="dxa" w:w="2880"/>
+          </w:tcPr>
+          <w:p>
+            <w:r>
+              <w:t>Desconocido / Other (resto)</w:t>
+            </w:r>
+          </w:p>
+        </w:tc>
+        <w:tc>
+          <w:tcPr>
+            <w:tcW w:type="dxa" w:w="2880"/>
+          </w:tcPr>
+          <w:p>
+            <w:r>
+              <w:t>205.05 GB</w:t>
+            </w:r>
+          </w:p>
+        </w:tc>
+        <w:tc>
+          <w:tcPr>
+            <w:tcW w:type="dxa" w:w="2880"/>
+          </w:tcPr>
+          <w:p>
+            <w:r>
+              <w:t>4.96 %</w:t>
+            </w:r>
+          </w:p>
+        </w:tc>
+      </w:tr>
     </w:tbl>
     <w:p/>
     <w:p>
       <w:r>
-        <w:t>Network Service corresponde al tráfico cifrado (QUIC/SSL) que Fortinet no abre. General Interest es sobre todo Google. Collaboration es WhatsApp y Microsoft 365. Update son parches de Windows y Adobe. Storage Backup es OneDrive, iCloud y Google Drive.</w:t>
+        <w:t>Network Service corresponde al tráfico cifrado (QUIC/SSL) que Fortinet no abre. General Interest es sobre todo Google. Collaboration es WhatsApp y Microsoft 365. Update son parches de Windows y Adobe. Storage Backup es OneDrive, iCloud y Google Drive. Desconocido / Other (resto) agrupa Unknown y las categorías menores de este corte (Social Media, Video/Audio, GenAI, Cloud, correo, VoIP y acceso remoto). Dentro de ese resto, la categoría Unknown de Fortinet es 90.62 GB (2.19 %).</w:t>
       </w:r>
     </w:p>
     <w:p>
@@ -397,7 +397,7 @@
     </w:p>
     <w:p>
       <w:r>
-        <w:t>Reputación (score alto, no equivale por sí solo a consumo): 1 172.17.23.2; 2 190.71.211.218; 3 SOPORTE; 4 2001:67c:254:b0b0::abba; 5 172.17.74.17; 6 158.69.177.101. 172.17.23.2 se mantiene primero todas las semanas; en el informe del 3 al 9 de agosto coincidía con la planta Grandstream UCM6204.</w:t>
+        <w:t>Reputación (score alto, no equivale por sí solo a consumo): 1 172.17.23.2; 2 190.71.211.218; 3 SOPORTE; 4 2001:67c:254:b0b0::abba; 5 172.17.74.17; 6 158.69.177.101. El primero de la lista no trae hostname de usuario en este corte.</w:t>
       </w:r>
     </w:p>
     <w:p>
@@ -461,7 +461,7 @@
     </w:p>
     <w:p>
       <w:r>
-        <w:t>El uso web permitido sigue dominado por Information Technology (622.66 GB) e Instant Messaging (303.81 GB). Lo anómalo es el salto a 4.04 TB de Application Control, explicado por Google.Services. Most Blocked ya no lo encabeza la pornografía: Freeware and Software Downloads suma 2,255,242 bloqueos (play.google.com y tiendas similares), Streaming 545,339, Shopping 264,296 y Gambling 32,984. Pornography baja a 2,075 bloqueos, frente a los 2.1 millones de la semana del 3 al 9 de agosto. Proxy Avoidance sigue presente (22,023).</w:t>
+        <w:t>El uso web permitido lo encabezan Information Technology (622.66 GB) e Instant Messaging (303.81 GB). Application Control suma 4.04 TB, explicado por Google.Services. La categoría más bloqueada es Freeware and Software Downloads, con 2,255,242 bloqueos (play.google.com y tiendas similares), Streaming 545,339, Shopping 264,296 y Gambling 32,984. Pornography registra 2,075 bloqueos. Proxy Avoidance registra 22,023 solicitudes.</w:t>
       </w:r>
     </w:p>
     <w:p>
@@ -582,7 +582,7 @@
         <w:t xml:space="preserve">TKT-UTM-2026-08-10-03 [Media] — Proxy / VPN: </w:t>
       </w:r>
       <w:r>
-        <w:t>Hola.VPN (26.30 MB) sigue presente, junto con Proxy.HTTP, Cloudflare VPN y Ultrasurf. Reforzar Application Control de la categoría Proxy.</w:t>
+        <w:t>Hola.VPN registra 26.30 MB, junto con Proxy.HTTP, Cloudflare VPN y Ultrasurf. Reforzar Application Control de la categoría Proxy.</w:t>
       </w:r>
     </w:p>
     <w:p>
@@ -617,7 +617,7 @@
     </w:p>
     <w:p>
       <w:r>
-        <w:t>Frente al informe del 3 al 9 de agosto se mantiene WhatsApp, Windows Update y la poca visibilidad de Fortinet sobre destinos encapsulados. La pornografía masiva de COM-TRIAGE01 no se repite en este corte. Sí persisten las radios de turno (virtualtronics y surfernetwork), los intentos de VPN/proxy y AnyDesk. 192.168.9.254 y 192.168.2.49 siguen entre los mayores consumidores y aún requieren hostname estable.</w:t>
+        <w:t>En los PDF de este corte, 172.17.74.17 concentra 1.32 TB de tráfico web hacia IPs de Google (172.217.28.106 y 172.217.162.138) sin dominio de negocio visible, y además registra 329,640 bloqueos. 192.168.9.254 y PBL-ADMISION02 sostienen stream-289.surfernetwork.com durante 1,440 minutos. AGC-FARMACIA01 consume radio35.virtualtronics.com. Hola.VPN aparece con 26.30 MB. Pornography registra 2,075 bloqueos y Gambling 32,984. 172.17.74.17 y 192.168.9.254 no tienen hostname.</w:t>
       </w:r>
     </w:p>
     <w:sectPr>

</xml_diff>